<commit_message>
docs: component specification (provided/required interfaces); fix C5 dependencies
Co-Authored-By: Claude Sonnet 5.5 <noreply@anthropic.com>
Claude-Session: https://claude.ai/code/session_01Cf2G3TpPkUnBMvTak1UT1v
</commit_message>
<xml_diff>
--- a/docs/Forge_SRS.docx
+++ b/docs/Forge_SRS.docx
@@ -16141,7 +16141,7 @@
                 <w:sz w:val="19"/>
                 <w:szCs w:val="19"/>
               </w:rPr>
-              <w:t xml:space="preserve">Dialogs shall trap keyboard focus while open and return focus to the element that opened them.</w:t>
+              <w:t xml:space="preserve">Bottom sheets shall trap keyboard focus while open and return focus to the element that opened them.</w:t>
             </w:r>
           </w:p>
         </w:tc>
@@ -16247,7 +16247,7 @@
                 <w:sz w:val="19"/>
                 <w:szCs w:val="19"/>
               </w:rPr>
-              <w:t xml:space="preserve">FR-UI-03</w:t>
+              <w:t xml:space="preserve">FR-UI-05</w:t>
             </w:r>
           </w:p>
         </w:tc>
@@ -16280,7 +16280,7 @@
                 <w:sz w:val="19"/>
                 <w:szCs w:val="19"/>
               </w:rPr>
-              <w:t xml:space="preserve">The system shall provide a numeric stepper, a modal, an undo toast and a barbell progress bar as reusable parts.</w:t>
+              <w:t xml:space="preserve">Modal dialogs shall use dialog semantics and a labelled close button.</w:t>
             </w:r>
           </w:p>
         </w:tc>
@@ -16313,7 +16313,7 @@
                 <w:sz w:val="19"/>
                 <w:szCs w:val="19"/>
               </w:rPr>
-              <w:t xml:space="preserve">M</w:t>
+              <w:t xml:space="preserve">S</w:t>
             </w:r>
           </w:p>
         </w:tc>
@@ -16385,6 +16385,146 @@
                 <w:sz w:val="19"/>
                 <w:szCs w:val="19"/>
               </w:rPr>
+              <w:t xml:space="preserve">FR-UI-03</w:t>
+            </w:r>
+          </w:p>
+        </w:tc>
+        <w:tc>
+          <w:tcPr>
+            <w:tcW w:type="dxa" w:w="6238"/>
+            <w:tcBorders>
+              <w:top w:val="single" w:color="BFC5CF" w:sz="4"/>
+              <w:left w:val="single" w:color="BFC5CF" w:sz="4"/>
+              <w:bottom w:val="single" w:color="BFC5CF" w:sz="4"/>
+              <w:right w:val="single" w:color="BFC5CF" w:sz="4"/>
+            </w:tcBorders>
+            <w:shd w:fill="F4F6F9" w:color="auto" w:val="clear"/>
+            <w:tcMar>
+              <w:top w:type="dxa" w:w="70"/>
+              <w:left w:type="dxa" w:w="100"/>
+              <w:bottom w:type="dxa" w:w="70"/>
+              <w:right w:type="dxa" w:w="100"/>
+            </w:tcMar>
+          </w:tcPr>
+          <w:p>
+            <w:pPr>
+              <w:spacing w:after="0"/>
+              <w:jc w:val="left"/>
+            </w:pPr>
+            <w:r>
+              <w:rPr>
+                <w:rFonts w:ascii="Calibri" w:cs="Calibri" w:eastAsia="Calibri" w:hAnsi="Calibri"/>
+                <w:b w:val="false"/>
+                <w:bCs w:val="false"/>
+                <w:sz w:val="19"/>
+                <w:szCs w:val="19"/>
+              </w:rPr>
+              <w:t xml:space="preserve">The system shall provide a numeric stepper, a modal, an undo toast and a barbell progress bar as reusable parts.</w:t>
+            </w:r>
+          </w:p>
+        </w:tc>
+        <w:tc>
+          <w:tcPr>
+            <w:tcW w:type="dxa" w:w="600"/>
+            <w:tcBorders>
+              <w:top w:val="single" w:color="BFC5CF" w:sz="4"/>
+              <w:left w:val="single" w:color="BFC5CF" w:sz="4"/>
+              <w:bottom w:val="single" w:color="BFC5CF" w:sz="4"/>
+              <w:right w:val="single" w:color="BFC5CF" w:sz="4"/>
+            </w:tcBorders>
+            <w:shd w:fill="F4F6F9" w:color="auto" w:val="clear"/>
+            <w:tcMar>
+              <w:top w:type="dxa" w:w="70"/>
+              <w:left w:type="dxa" w:w="100"/>
+              <w:bottom w:type="dxa" w:w="70"/>
+              <w:right w:type="dxa" w:w="100"/>
+            </w:tcMar>
+          </w:tcPr>
+          <w:p>
+            <w:pPr>
+              <w:spacing w:after="0"/>
+              <w:jc w:val="left"/>
+            </w:pPr>
+            <w:r>
+              <w:rPr>
+                <w:rFonts w:ascii="Calibri" w:cs="Calibri" w:eastAsia="Calibri" w:hAnsi="Calibri"/>
+                <w:b w:val="false"/>
+                <w:bCs w:val="false"/>
+                <w:sz w:val="19"/>
+                <w:szCs w:val="19"/>
+              </w:rPr>
+              <w:t xml:space="preserve">M</w:t>
+            </w:r>
+          </w:p>
+        </w:tc>
+        <w:tc>
+          <w:tcPr>
+            <w:tcW w:type="dxa" w:w="1400"/>
+            <w:tcBorders>
+              <w:top w:val="single" w:color="BFC5CF" w:sz="4"/>
+              <w:left w:val="single" w:color="BFC5CF" w:sz="4"/>
+              <w:bottom w:val="single" w:color="BFC5CF" w:sz="4"/>
+              <w:right w:val="single" w:color="BFC5CF" w:sz="4"/>
+            </w:tcBorders>
+            <w:shd w:fill="F4F6F9" w:color="auto" w:val="clear"/>
+            <w:tcMar>
+              <w:top w:type="dxa" w:w="70"/>
+              <w:left w:type="dxa" w:w="100"/>
+              <w:bottom w:type="dxa" w:w="70"/>
+              <w:right w:type="dxa" w:w="100"/>
+            </w:tcMar>
+          </w:tcPr>
+          <w:p>
+            <w:pPr>
+              <w:spacing w:after="0"/>
+              <w:jc w:val="left"/>
+            </w:pPr>
+            <w:r>
+              <w:rPr>
+                <w:rFonts w:ascii="Calibri" w:cs="Calibri" w:eastAsia="Calibri" w:hAnsi="Calibri"/>
+                <w:b w:val="false"/>
+                <w:bCs w:val="false"/>
+                <w:sz w:val="19"/>
+                <w:szCs w:val="19"/>
+              </w:rPr>
+              <w:t xml:space="preserve">All</w:t>
+            </w:r>
+          </w:p>
+        </w:tc>
+      </w:tr>
+      <w:tr>
+        <w:trPr>
+          <w:cantSplit/>
+        </w:trPr>
+        <w:tc>
+          <w:tcPr>
+            <w:tcW w:type="dxa" w:w="1400"/>
+            <w:tcBorders>
+              <w:top w:val="single" w:color="BFC5CF" w:sz="4"/>
+              <w:left w:val="single" w:color="BFC5CF" w:sz="4"/>
+              <w:bottom w:val="single" w:color="BFC5CF" w:sz="4"/>
+              <w:right w:val="single" w:color="BFC5CF" w:sz="4"/>
+            </w:tcBorders>
+            <w:tcMar>
+              <w:top w:type="dxa" w:w="70"/>
+              <w:left w:type="dxa" w:w="100"/>
+              <w:bottom w:type="dxa" w:w="70"/>
+              <w:right w:type="dxa" w:w="100"/>
+            </w:tcMar>
+          </w:tcPr>
+          <w:p>
+            <w:pPr>
+              <w:spacing w:after="0"/>
+              <w:jc w:val="left"/>
+            </w:pPr>
+            <w:r>
+              <w:rPr>
+                <w:rFonts w:ascii="Calibri" w:cs="Calibri" w:eastAsia="Calibri" w:hAnsi="Calibri"/>
+                <w:b/>
+                <w:bCs/>
+                <w:sz w:val="19"/>
+                <w:szCs w:val="19"/>
+              </w:rPr>
               <w:t xml:space="preserve">FR-UI-04</w:t>
             </w:r>
           </w:p>
@@ -16398,7 +16538,6 @@
               <w:bottom w:val="single" w:color="BFC5CF" w:sz="4"/>
               <w:right w:val="single" w:color="BFC5CF" w:sz="4"/>
             </w:tcBorders>
-            <w:shd w:fill="F4F6F9" w:color="auto" w:val="clear"/>
             <w:tcMar>
               <w:top w:type="dxa" w:w="70"/>
               <w:left w:type="dxa" w:w="100"/>
@@ -16432,7 +16571,6 @@
               <w:bottom w:val="single" w:color="BFC5CF" w:sz="4"/>
               <w:right w:val="single" w:color="BFC5CF" w:sz="4"/>
             </w:tcBorders>
-            <w:shd w:fill="F4F6F9" w:color="auto" w:val="clear"/>
             <w:tcMar>
               <w:top w:type="dxa" w:w="70"/>
               <w:left w:type="dxa" w:w="100"/>
@@ -16466,7 +16604,6 @@
               <w:bottom w:val="single" w:color="BFC5CF" w:sz="4"/>
               <w:right w:val="single" w:color="BFC5CF" w:sz="4"/>
             </w:tcBorders>
-            <w:shd w:fill="F4F6F9" w:color="auto" w:val="clear"/>
             <w:tcMar>
               <w:top w:type="dxa" w:w="70"/>
               <w:left w:type="dxa" w:w="100"/>
@@ -26444,7 +26581,7 @@
                 <w:sz w:val="19"/>
                 <w:szCs w:val="19"/>
               </w:rPr>
-              <w:t xml:space="preserve">FR-UI (4 requirements)</w:t>
+              <w:t xml:space="preserve">FR-UI (5 requirements)</w:t>
             </w:r>
           </w:p>
         </w:tc>

</xml_diff>